<commit_message>
stage one full spider test reporting
</commit_message>
<xml_diff>
--- a/Dilina/NL TO SQL prototype/Supervisor_Progress_Report.docx
+++ b/Dilina/NL TO SQL prototype/Supervisor_Progress_Report.docx
@@ -463,7 +463,7 @@
           <w:color w:val="1B365D"/>
           <w:sz w:val="32"/>
         </w:rPr>
-        <w:t>4. Empirical Benchmark Results (N = 100 Queries)</w:t>
+        <w:t>4. Stage 1 Baseline Empirical Benchmark Results (N = 1,034 Queries)</w:t>
       </w:r>
     </w:p>
     <w:p>
@@ -471,7 +471,7 @@
         <w:spacing w:after="120"/>
       </w:pPr>
       <w:r>
-        <w:t>To evaluate baseline performance, N = 100 queries were evaluated across all 4 difficulty levels (easy, medium, hard, extra) using Meta Llama-3.3-70B (Baseline), Meta Llama-3.1-8B (Model Scale Comparison), and Cohere North Mini Code (Specialized Code LLM).</w:t>
+        <w:t>To establish a comprehensive, un-throttled baseline for the research project, all N = 1,034 Spider benchmark queries were evaluated across all 4 difficulty levels (easy, medium, hard, extra) using Cerebras Cloud 31B (gemma-4-31b). With our zero-skip infinite retry loop, 0 queries were dropped or skipped due to rate limits.</w:t>
       </w:r>
     </w:p>
     <w:tbl>
@@ -481,15 +481,14 @@
         <w:tblLook w:firstColumn="1" w:firstRow="1" w:lastColumn="0" w:lastRow="0" w:noHBand="0" w:noVBand="1" w:val="04A0"/>
       </w:tblPr>
       <w:tblGrid>
-        <w:gridCol w:w="2340"/>
-        <w:gridCol w:w="2340"/>
-        <w:gridCol w:w="2340"/>
-        <w:gridCol w:w="2340"/>
+        <w:gridCol w:w="3120"/>
+        <w:gridCol w:w="3120"/>
+        <w:gridCol w:w="3120"/>
       </w:tblGrid>
       <w:tr>
         <w:tc>
           <w:tcPr>
-            <w:tcW w:type="dxa" w:w="2340"/>
+            <w:tcW w:type="dxa" w:w="3120"/>
             <w:shd w:fill="1B365D"/>
           </w:tcPr>
           <w:p>
@@ -504,7 +503,7 @@
         </w:tc>
         <w:tc>
           <w:tcPr>
-            <w:tcW w:type="dxa" w:w="2340"/>
+            <w:tcW w:type="dxa" w:w="3120"/>
             <w:shd w:fill="1B365D"/>
           </w:tcPr>
           <w:p>
@@ -513,13 +512,13 @@
                 <w:b/>
                 <w:color w:val="FFFFFF"/>
               </w:rPr>
-              <w:t>Llama-3.3-70B (Baseline)</w:t>
+              <w:t>Stage 1 Baseline (Full DDL N=1,034)</w:t>
             </w:r>
           </w:p>
         </w:tc>
         <w:tc>
           <w:tcPr>
-            <w:tcW w:type="dxa" w:w="2340"/>
+            <w:tcW w:type="dxa" w:w="3120"/>
             <w:shd w:fill="1B365D"/>
           </w:tcPr>
           <w:p>
@@ -528,22 +527,7 @@
                 <w:b/>
                 <w:color w:val="FFFFFF"/>
               </w:rPr>
-              <w:t>Llama-3.1-8B (Small)</w:t>
-            </w:r>
-          </w:p>
-        </w:tc>
-        <w:tc>
-          <w:tcPr>
-            <w:tcW w:type="dxa" w:w="2340"/>
-            <w:shd w:fill="1B365D"/>
-          </w:tcPr>
-          <w:p>
-            <w:r>
-              <w:rPr>
-                <w:b/>
-                <w:color w:val="FFFFFF"/>
-              </w:rPr>
-              <w:t>Cohere Code (Specialized)</w:t>
+              <w:t>Empirical Finding &amp; Research Takeaway</w:t>
             </w:r>
           </w:p>
         </w:tc>
@@ -551,7 +535,7 @@
       <w:tr>
         <w:tc>
           <w:tcPr>
-            <w:tcW w:type="dxa" w:w="2340"/>
+            <w:tcW w:type="dxa" w:w="3120"/>
             <w:shd w:fill="F0F4F8"/>
           </w:tcPr>
           <w:p>
@@ -565,7 +549,7 @@
         </w:tc>
         <w:tc>
           <w:tcPr>
-            <w:tcW w:type="dxa" w:w="2340"/>
+            <w:tcW w:type="dxa" w:w="3120"/>
             <w:shd w:fill="F0F4F8"/>
           </w:tcPr>
           <w:p>
@@ -573,13 +557,13 @@
               <w:rPr>
                 <w:b w:val="0"/>
               </w:rPr>
-              <w:t>77.00% (77/100)</w:t>
+              <w:t>65.18% (674 / 1,034 correct)</w:t>
             </w:r>
           </w:p>
         </w:tc>
         <w:tc>
           <w:tcPr>
-            <w:tcW w:type="dxa" w:w="2340"/>
+            <w:tcW w:type="dxa" w:w="3120"/>
             <w:shd w:fill="F0F4F8"/>
           </w:tcPr>
           <w:p>
@@ -587,21 +571,7 @@
               <w:rPr>
                 <w:b w:val="0"/>
               </w:rPr>
-              <w:t>68.00% (68/100)</w:t>
-            </w:r>
-          </w:p>
-        </w:tc>
-        <w:tc>
-          <w:tcPr>
-            <w:tcW w:type="dxa" w:w="2340"/>
-            <w:shd w:fill="F0F4F8"/>
-          </w:tcPr>
-          <w:p>
-            <w:r>
-              <w:rPr>
-                <w:b w:val="0"/>
-              </w:rPr>
-              <w:t>71.43% (35/49 valid)</w:t>
+              <w:t>High baseline accuracy achieved on open 31B model</w:t>
             </w:r>
           </w:p>
         </w:tc>
@@ -609,7 +579,49 @@
       <w:tr>
         <w:tc>
           <w:tcPr>
-            <w:tcW w:type="dxa" w:w="2340"/>
+            <w:tcW w:type="dxa" w:w="3120"/>
+          </w:tcPr>
+          <w:p>
+            <w:r>
+              <w:rPr>
+                <w:b/>
+              </w:rPr>
+              <w:t>Average Prompt Tokens</w:t>
+            </w:r>
+          </w:p>
+        </w:tc>
+        <w:tc>
+          <w:tcPr>
+            <w:tcW w:type="dxa" w:w="3120"/>
+          </w:tcPr>
+          <w:p>
+            <w:r>
+              <w:rPr>
+                <w:b w:val="0"/>
+              </w:rPr>
+              <w:t>448.6 tokens / query</w:t>
+            </w:r>
+          </w:p>
+        </w:tc>
+        <w:tc>
+          <w:tcPr>
+            <w:tcW w:type="dxa" w:w="3120"/>
+          </w:tcPr>
+          <w:p>
+            <w:r>
+              <w:rPr>
+                <w:b w:val="0"/>
+              </w:rPr>
+              <w:t>Dumping full DDL results in heavy token consumption</w:t>
+            </w:r>
+          </w:p>
+        </w:tc>
+      </w:tr>
+      <w:tr>
+        <w:tc>
+          <w:tcPr>
+            <w:tcW w:type="dxa" w:w="3120"/>
+            <w:shd w:fill="F0F4F8"/>
           </w:tcPr>
           <w:p>
             <w:r>
@@ -622,40 +634,29 @@
         </w:tc>
         <w:tc>
           <w:tcPr>
-            <w:tcW w:type="dxa" w:w="2340"/>
+            <w:tcW w:type="dxa" w:w="3120"/>
+            <w:shd w:fill="F0F4F8"/>
           </w:tcPr>
           <w:p>
             <w:r>
               <w:rPr>
                 <w:b w:val="0"/>
               </w:rPr>
-              <w:t>0 (0.0%)</w:t>
+              <w:t>7 errors (0.7%)</w:t>
             </w:r>
           </w:p>
         </w:tc>
         <w:tc>
           <w:tcPr>
-            <w:tcW w:type="dxa" w:w="2340"/>
+            <w:tcW w:type="dxa" w:w="3120"/>
+            <w:shd w:fill="F0F4F8"/>
           </w:tcPr>
           <w:p>
             <w:r>
               <w:rPr>
                 <w:b w:val="0"/>
               </w:rPr>
-              <w:t>13 (13.0%)</w:t>
-            </w:r>
-          </w:p>
-        </w:tc>
-        <w:tc>
-          <w:tcPr>
-            <w:tcW w:type="dxa" w:w="2340"/>
-          </w:tcPr>
-          <w:p>
-            <w:r>
-              <w:rPr>
-                <w:b w:val="0"/>
-              </w:rPr>
-              <w:t>0 (0.0%)</w:t>
+              <w:t>Full DDL creates distractor tables leading to column hallucination</w:t>
             </w:r>
           </w:p>
         </w:tc>
@@ -663,7 +664,48 @@
       <w:tr>
         <w:tc>
           <w:tcPr>
-            <w:tcW w:type="dxa" w:w="2340"/>
+            <w:tcW w:type="dxa" w:w="3120"/>
+          </w:tcPr>
+          <w:p>
+            <w:r>
+              <w:rPr>
+                <w:b/>
+              </w:rPr>
+              <w:t>Foreign Key JOIN Errors</w:t>
+            </w:r>
+          </w:p>
+        </w:tc>
+        <w:tc>
+          <w:tcPr>
+            <w:tcW w:type="dxa" w:w="3120"/>
+          </w:tcPr>
+          <w:p>
+            <w:r>
+              <w:rPr>
+                <w:b w:val="0"/>
+              </w:rPr>
+              <w:t>7 errors (0.7%)</w:t>
+            </w:r>
+          </w:p>
+        </w:tc>
+        <w:tc>
+          <w:tcPr>
+            <w:tcW w:type="dxa" w:w="3120"/>
+          </w:tcPr>
+          <w:p>
+            <w:r>
+              <w:rPr>
+                <w:b w:val="0"/>
+              </w:rPr>
+              <w:t>Multi-table JOIN queries occasionally fail without graph traversal</w:t>
+            </w:r>
+          </w:p>
+        </w:tc>
+      </w:tr>
+      <w:tr>
+        <w:tc>
+          <w:tcPr>
+            <w:tcW w:type="dxa" w:w="3120"/>
             <w:shd w:fill="F0F4F8"/>
           </w:tcPr>
           <w:p>
@@ -671,13 +713,13 @@
               <w:rPr>
                 <w:b/>
               </w:rPr>
-              <w:t>Primary Failure Mode</w:t>
+              <w:t>Syntax Errors</w:t>
             </w:r>
           </w:p>
         </w:tc>
         <w:tc>
           <w:tcPr>
-            <w:tcW w:type="dxa" w:w="2340"/>
+            <w:tcW w:type="dxa" w:w="3120"/>
             <w:shd w:fill="F0F4F8"/>
           </w:tcPr>
           <w:p>
@@ -685,13 +727,13 @@
               <w:rPr>
                 <w:b w:val="0"/>
               </w:rPr>
-              <w:t>RESULT_MISMATCH (20)</w:t>
+              <w:t>185 errors (17.9%)</w:t>
             </w:r>
           </w:p>
         </w:tc>
         <w:tc>
           <w:tcPr>
-            <w:tcW w:type="dxa" w:w="2340"/>
+            <w:tcW w:type="dxa" w:w="3120"/>
             <w:shd w:fill="F0F4F8"/>
           </w:tcPr>
           <w:p>
@@ -699,75 +741,7 @@
               <w:rPr>
                 <w:b w:val="0"/>
               </w:rPr>
-              <w:t>SCHEMA_LINKING (13)</w:t>
-            </w:r>
-          </w:p>
-        </w:tc>
-        <w:tc>
-          <w:tcPr>
-            <w:tcW w:type="dxa" w:w="2340"/>
-            <w:shd w:fill="F0F4F8"/>
-          </w:tcPr>
-          <w:p>
-            <w:r>
-              <w:rPr>
-                <w:b w:val="0"/>
-              </w:rPr>
-              <w:t>RESULT_MISMATCH (11)</w:t>
-            </w:r>
-          </w:p>
-        </w:tc>
-      </w:tr>
-      <w:tr>
-        <w:tc>
-          <w:tcPr>
-            <w:tcW w:type="dxa" w:w="2340"/>
-          </w:tcPr>
-          <w:p>
-            <w:r>
-              <w:rPr>
-                <w:b/>
-              </w:rPr>
-              <w:t>LLM Latency Bottleneck</w:t>
-            </w:r>
-          </w:p>
-        </w:tc>
-        <w:tc>
-          <w:tcPr>
-            <w:tcW w:type="dxa" w:w="2340"/>
-          </w:tcPr>
-          <w:p>
-            <w:r>
-              <w:rPr>
-                <w:b w:val="0"/>
-              </w:rPr>
-              <w:t>99.6% (210.95s total)</w:t>
-            </w:r>
-          </w:p>
-        </w:tc>
-        <w:tc>
-          <w:tcPr>
-            <w:tcW w:type="dxa" w:w="2340"/>
-          </w:tcPr>
-          <w:p>
-            <w:r>
-              <w:rPr>
-                <w:b w:val="0"/>
-              </w:rPr>
-              <w:t>99.6% (276.32s total)</w:t>
-            </w:r>
-          </w:p>
-        </w:tc>
-        <w:tc>
-          <w:tcPr>
-            <w:tcW w:type="dxa" w:w="2340"/>
-          </w:tcPr>
-          <w:p>
-            <w:r>
-              <w:rPr>
-                <w:b w:val="0"/>
-              </w:rPr>
-              <w:t>85.4% (1063.17s total)</w:t>
+              <w:t>T-SQL pagination syntax (OFFSET/FETCH) confused with SQLite LIMIT</w:t>
             </w:r>
           </w:p>
         </w:tc>

</xml_diff>